<commit_message>
Informe JD en lenguaje más sencillo y con la viabilidad de la financiación
Co-Authored-By: Claude Opus 5.5 <noreply@anthropic.com>
Claude-Session: https://claude.ai/code/session_01AXZpzF115NrenFi3tJkRN6
</commit_message>
<xml_diff>
--- a/Valoracion_AirThread_Connections/informe_JD/Informe_JD_AirThread.docx
+++ b/Valoracion_AirThread_Connections/informe_JD/Informe_JD_AirThread.docx
@@ -12,7 +12,7 @@
           <w:color w:val="666666"/>
           <w:sz w:val="16"/>
         </w:rPr>
-        <w:t>MEMORANDO A LA JUNTA DIRECTIVA · AMERICAN CABLE COMMUNICATIONS</w:t>
+        <w:t>MEMORANDO A LA JUNTA DIRECTIVA · AMERICAN CABLE COMMUNICATIONS (ACC)</w:t>
       </w:r>
     </w:p>
     <w:p>
@@ -25,7 +25,7 @@
           <w:color w:val="666666"/>
           <w:sz w:val="16"/>
         </w:rPr>
-        <w:t>De: Desarrollo de Negocios (Grupo 3) · Diciembre de 2007 · Cifras en millones de US$</w:t>
+        <w:t>De: Desarrollo de Negocios (Grupo 3) · Diciembre de 2007 · Todas las cifras en millones de US$</w:t>
       </w:r>
     </w:p>
     <w:p>
@@ -36,9 +36,9 @@
         <w:rPr>
           <w:b/>
           <w:color w:val="1F3864"/>
-          <w:sz w:val="34"/>
+          <w:sz w:val="32"/>
         </w:rPr>
-        <w:t>Compra de AirThread: ofertar, pero no pagar más de US$7.391 millones</w:t>
+        <w:t>Compra de AirThread: recomendamos ofertar, con un precio máximo de US$7.391 millones</w:t>
       </w:r>
     </w:p>
     <w:tbl>
@@ -78,7 +78,7 @@
                 <w:b w:val="0"/>
                 <w:sz w:val="21"/>
               </w:rPr>
-              <w:t>presentar una oferta por el 100% de AirThread Connections (ATC). Abrir en US$5.979 millones, buscar cerrar en US$7.017 millones y retirarse si el precio supera US$7.391 millones. Ese tope paga lo que ATC vale por sí sola más el ahorro de backhaul que solo ACC puede generar con su fibra; no paga por adelantado las sinergias de ingresos, que son inciertas.</w:t>
+              <w:t>comprar el 100% de AirThread Connections (ATC), siempre que el precio no supere US$7.391 millones. Proponemos abrir la negociación en US$5.979 millones y buscar cerrar cerca de US$7.017 millones. Si el vendedor pide más, ACC debe retirarse: por encima de ese precio estaríamos pagando por beneficios inciertos que solo existirían gracias a ACC.</w:t>
             </w:r>
           </w:p>
         </w:tc>
@@ -103,7 +103,7 @@
           <w:color w:val="1F3864"/>
           <w:sz w:val="25"/>
         </w:rPr>
-        <w:t>1. El problema: cuánto pagar sin destruir valor</w:t>
+        <w:t>1. La decisión que debe tomar la Junta</w:t>
       </w:r>
     </w:p>
     <w:p>
@@ -115,7 +115,38 @@
           <w:b w:val="0"/>
           <w:sz w:val="21"/>
         </w:rPr>
-        <w:t>ACC necesita una oferta inalámbrica para competir con los operadores que venden paquetes. ATC le da esa oferta, pero el mayor riesgo de la operación es pagar de más. Los hechos que importan:</w:t>
+        <w:t xml:space="preserve">ACC ofrece televisión, internet y telefonía fija, pero no telefonía celular. Sus competidores ya venden paquetes que incluyen celular, y ACC corre el riesgo de quedarse atrás. Comprar ATC, un operador celular regional, resolvería ese vacío. La pregunta no es solo si comprar, sino </w:t>
+      </w:r>
+      <w:r>
+        <w:rPr>
+          <w:b/>
+          <w:sz w:val="21"/>
+        </w:rPr>
+        <w:t>cuánto pagar sin destruir valor para los accionistas</w:t>
+      </w:r>
+      <w:r>
+        <w:rPr>
+          <w:b w:val="0"/>
+          <w:sz w:val="21"/>
+        </w:rPr>
+        <w:t>: pagar de más es la forma más común en que una adquisición fracasa.</w:t>
+      </w:r>
+    </w:p>
+    <w:p>
+      <w:pPr>
+        <w:keepNext/>
+        <w:spacing w:after="30" w:before="200"/>
+        <w:pBdr>
+          <w:bottom w:val="single" w:sz="6" w:color="1F3864"/>
+        </w:pBdr>
+      </w:pPr>
+      <w:r>
+        <w:rPr>
+          <w:b/>
+          <w:color w:val="1F3864"/>
+          <w:sz w:val="25"/>
+        </w:rPr>
+        <w:t>2. Lo que sabemos</w:t>
       </w:r>
     </w:p>
     <w:p>
@@ -129,14 +160,14 @@
           <w:b/>
           <w:sz w:val="21"/>
         </w:rPr>
-        <w:t xml:space="preserve">ATC es rentable, pero está en desventaja. </w:t>
+        <w:t xml:space="preserve">ATC es rentable, pero más débil que sus competidores. </w:t>
       </w:r>
       <w:r>
         <w:rPr>
           <w:b w:val="0"/>
           <w:sz w:val="21"/>
         </w:rPr>
-        <w:t>Su margen EBITDA es 26,2%, frente a 31,6% de sus rivales. En 2007 su ingreso por minuto cayó 11,3% y el costo de captar un cliente subió 26,5%.</w:t>
+        <w:t>De cada US$100 que vende, le quedan US$26 de utilidad operativa (antes de depreciación), frente a US$32 de sus rivales. Además, en 2007 el precio que cobra por minuto bajó 11,3% y conseguir cada cliente nuevo le costó 26,5% más.</w:t>
       </w:r>
     </w:p>
     <w:p>
@@ -150,14 +181,14 @@
           <w:b/>
           <w:sz w:val="21"/>
         </w:rPr>
-        <w:t xml:space="preserve">Por sí sola vale US$6.643 millones </w:t>
+        <w:t xml:space="preserve">Por sí sola, ATC vale unos US$6.643 millones. </w:t>
       </w:r>
       <w:r>
         <w:rPr>
           <w:b w:val="0"/>
           <w:sz w:val="21"/>
         </w:rPr>
-        <w:t>(patrimonio, 5,8 veces su EBITDA de 2007). Es un flujo de caja descontado con WACC de 7,60% y crecimiento perpetuo de 2,78%; el 79% del valor está después de 2012.</w:t>
+        <w:t>Estimamos el dinero que generará en los próximos años y lo llevamos a valor de hoy, exigiendo un rendimiento de 7,6% anual, que es lo que cuesta financiar la compra. Ese valor equivale a 5,8 veces su utilidad operativa de 2007.</w:t>
       </w:r>
     </w:p>
     <w:p>
@@ -171,14 +202,14 @@
           <w:b/>
           <w:sz w:val="21"/>
         </w:rPr>
-        <w:t xml:space="preserve">Con ACC vale US$2.524 millones más. </w:t>
+        <w:t xml:space="preserve">Junto con ACC, ATC vale US$2.524 millones más. </w:t>
       </w:r>
       <w:r>
         <w:rPr>
           <w:b w:val="0"/>
           <w:sz w:val="21"/>
         </w:rPr>
-        <w:t>US$748 millones salen del backhaul (usar la fibra de ACC ahorra US$76 millones al año en 2012) y US$1.776 millones de clientes empresariales: el 70% de las sinergias, sin un margen documentado.</w:t>
+        <w:t>US$748 millones vienen de ahorrar costos: ATC podría usar la red de fibra de ACC para conectar sus antenas, en lugar de alquilar líneas (US$76 millones de ahorro al año en 2012). Los otros US$1.776 millones vendrían de vender planes celulares a empresas clientes de ACC, pero esa cifra es una estimación sin experiencia previa que la respalde.</w:t>
       </w:r>
     </w:p>
     <w:p>
@@ -192,14 +223,14 @@
           <w:b/>
           <w:sz w:val="21"/>
         </w:rPr>
-        <w:t xml:space="preserve">El mercado sugiere precios mucho mayores. </w:t>
+        <w:t xml:space="preserve">El vendedor probablemente pedirá mucho más. </w:t>
       </w:r>
       <w:r>
         <w:rPr>
           <w:b w:val="0"/>
           <w:sz w:val="21"/>
         </w:rPr>
-        <w:t>Con el múltiplo mediano de los comparables (10,3 veces el EBITDA), ATC valdría US$13.950 millones, pero eso exige que crezca 6,6% al año para siempre.</w:t>
+        <w:t>Si se usa el precio al que se negocian empresas parecidas, ATC valdría US$13.950 millones. Para justificarlo, ATC tendría que crecer 6,6% al año para siempre, algo poco realista para una empresa que está perdiendo margen.</w:t>
       </w:r>
     </w:p>
     <w:p>
@@ -213,14 +244,14 @@
           <w:b/>
           <w:sz w:val="21"/>
         </w:rPr>
-        <w:t xml:space="preserve">La deuda propuesta por el banco es alta. </w:t>
+        <w:t xml:space="preserve">La financiación propuesta por el banco es exigente. </w:t>
       </w:r>
       <w:r>
         <w:rPr>
           <w:b w:val="0"/>
           <w:sz w:val="21"/>
         </w:rPr>
-        <w:t>US$3.758 millones equivalen al 62,7% del valor de las operaciones (límite: 50%), y el flujo de ATC no alcanza para las cuotas: en 2011 ya necesita US$430 millones de línea de crédito.</w:t>
+        <w:t>El banco ofrece prestar US$3.758 millones. Es el 47,4% del valor total de ATC, justo por debajo del 50% que recomienda el banco. Sin embargo, el dinero que genera ATC no alcanza para pagar las cuotas: necesitaría un crédito adicional que llegaría a US$563 millones en 2012, cuando además habrá que renovar un saldo de US$2.135 millones.</w:t>
       </w:r>
     </w:p>
     <w:tbl>
@@ -236,7 +267,7 @@
       <w:tr>
         <w:tc>
           <w:tcPr>
-            <w:tcW w:type="dxa" w:w="5386"/>
+            <w:tcW w:type="dxa" w:w="5953"/>
             <w:shd w:val="clear" w:color="auto" w:fill="1F3864"/>
           </w:tcPr>
           <w:p>
@@ -246,7 +277,7 @@
                 <w:color w:val="FFFFFF"/>
                 <w:sz w:val="19"/>
               </w:rPr>
-              <w:t>Cómo se llega al valor</w:t>
+              <w:t>¿Cuánto vale ATC? (patrimonio, 100%)</w:t>
             </w:r>
           </w:p>
         </w:tc>
@@ -273,7 +304,7 @@
       <w:tr>
         <w:tc>
           <w:tcPr>
-            <w:tcW w:type="dxa" w:w="5386"/>
+            <w:tcW w:type="dxa" w:w="5953"/>
             <w:tcBorders>
               <w:top w:val="single" w:sz="4" w:color="BFC9DC"/>
               <w:left w:val="single" w:sz="4" w:color="BFC9DC"/>
@@ -294,7 +325,7 @@
                 <w:b w:val="0"/>
                 <w:sz w:val="19"/>
               </w:rPr>
-              <w:t>Valor de las operaciones (flujo de caja descontado)</w:t>
+              <w:t>ATC por sí sola</w:t>
             </w:r>
           </w:p>
         </w:tc>
@@ -322,7 +353,7 @@
                 <w:b w:val="0"/>
                 <w:sz w:val="19"/>
               </w:rPr>
-              <w:t>5.989</w:t>
+              <w:t>6.643</w:t>
             </w:r>
           </w:p>
         </w:tc>
@@ -330,7 +361,7 @@
       <w:tr>
         <w:tc>
           <w:tcPr>
-            <w:tcW w:type="dxa" w:w="5386"/>
+            <w:tcW w:type="dxa" w:w="5953"/>
             <w:tcBorders>
               <w:top w:val="single" w:sz="4" w:color="BFC9DC"/>
               <w:left w:val="single" w:sz="4" w:color="BFC9DC"/>
@@ -351,180 +382,7 @@
                 <w:b w:val="0"/>
                 <w:sz w:val="19"/>
               </w:rPr>
-              <w:t>+ Caja, afiliadas y nota por cobrar</w:t>
-            </w:r>
-          </w:p>
-        </w:tc>
-        <w:tc>
-          <w:tcPr>
-            <w:tcW w:type="dxa" w:w="1587"/>
-            <w:tcBorders>
-              <w:top w:val="single" w:sz="4" w:color="BFC9DC"/>
-              <w:left w:val="single" w:sz="4" w:color="BFC9DC"/>
-              <w:bottom w:val="single" w:sz="4" w:color="BFC9DC"/>
-              <w:right w:val="single" w:sz="4" w:color="BFC9DC"/>
-            </w:tcBorders>
-            <w:tcMar>
-              <w:left w:w="68" w:type="dxa"/>
-              <w:right w:w="68" w:type="dxa"/>
-            </w:tcMar>
-          </w:tcPr>
-          <w:p>
-            <w:pPr>
-              <w:spacing w:after="0"/>
-              <w:jc w:val="right"/>
-            </w:pPr>
-            <w:r>
-              <w:rPr>
-                <w:b w:val="0"/>
-                <w:sz w:val="19"/>
-              </w:rPr>
-              <w:t>1.944</w:t>
-            </w:r>
-          </w:p>
-        </w:tc>
-      </w:tr>
-      <w:tr>
-        <w:tc>
-          <w:tcPr>
-            <w:tcW w:type="dxa" w:w="5386"/>
-            <w:tcBorders>
-              <w:top w:val="single" w:sz="4" w:color="BFC9DC"/>
-              <w:left w:val="single" w:sz="4" w:color="BFC9DC"/>
-              <w:bottom w:val="single" w:sz="4" w:color="BFC9DC"/>
-              <w:right w:val="single" w:sz="4" w:color="BFC9DC"/>
-            </w:tcBorders>
-            <w:tcMar>
-              <w:left w:w="68" w:type="dxa"/>
-              <w:right w:w="68" w:type="dxa"/>
-            </w:tcMar>
-          </w:tcPr>
-          <w:p>
-            <w:pPr>
-              <w:spacing w:after="0"/>
-            </w:pPr>
-            <w:r>
-              <w:rPr>
-                <w:b w:val="0"/>
-                <w:sz w:val="19"/>
-              </w:rPr>
-              <w:t>− Deuda existente e interés minoritario</w:t>
-            </w:r>
-          </w:p>
-        </w:tc>
-        <w:tc>
-          <w:tcPr>
-            <w:tcW w:type="dxa" w:w="1587"/>
-            <w:tcBorders>
-              <w:top w:val="single" w:sz="4" w:color="BFC9DC"/>
-              <w:left w:val="single" w:sz="4" w:color="BFC9DC"/>
-              <w:bottom w:val="single" w:sz="4" w:color="BFC9DC"/>
-              <w:right w:val="single" w:sz="4" w:color="BFC9DC"/>
-            </w:tcBorders>
-            <w:tcMar>
-              <w:left w:w="68" w:type="dxa"/>
-              <w:right w:w="68" w:type="dxa"/>
-            </w:tcMar>
-          </w:tcPr>
-          <w:p>
-            <w:pPr>
-              <w:spacing w:after="0"/>
-              <w:jc w:val="right"/>
-            </w:pPr>
-            <w:r>
-              <w:rPr>
-                <w:b w:val="0"/>
-                <w:sz w:val="19"/>
-              </w:rPr>
-              <w:t>−1.290</w:t>
-            </w:r>
-          </w:p>
-        </w:tc>
-      </w:tr>
-      <w:tr>
-        <w:tc>
-          <w:tcPr>
-            <w:tcW w:type="dxa" w:w="5386"/>
-            <w:tcBorders>
-              <w:top w:val="single" w:sz="4" w:color="BFC9DC"/>
-              <w:left w:val="single" w:sz="4" w:color="BFC9DC"/>
-              <w:bottom w:val="single" w:sz="4" w:color="BFC9DC"/>
-              <w:right w:val="single" w:sz="4" w:color="BFC9DC"/>
-            </w:tcBorders>
-            <w:tcMar>
-              <w:left w:w="68" w:type="dxa"/>
-              <w:right w:w="68" w:type="dxa"/>
-            </w:tcMar>
-            <w:shd w:val="clear" w:color="auto" w:fill="E8EEF7"/>
-          </w:tcPr>
-          <w:p>
-            <w:pPr>
-              <w:spacing w:after="0"/>
-            </w:pPr>
-            <w:r>
-              <w:rPr>
-                <w:b/>
-                <w:sz w:val="19"/>
-              </w:rPr>
-              <w:t>Valor del patrimonio de ATC por sí sola</w:t>
-            </w:r>
-          </w:p>
-        </w:tc>
-        <w:tc>
-          <w:tcPr>
-            <w:tcW w:type="dxa" w:w="1587"/>
-            <w:tcBorders>
-              <w:top w:val="single" w:sz="4" w:color="BFC9DC"/>
-              <w:left w:val="single" w:sz="4" w:color="BFC9DC"/>
-              <w:bottom w:val="single" w:sz="4" w:color="BFC9DC"/>
-              <w:right w:val="single" w:sz="4" w:color="BFC9DC"/>
-            </w:tcBorders>
-            <w:tcMar>
-              <w:left w:w="68" w:type="dxa"/>
-              <w:right w:w="68" w:type="dxa"/>
-            </w:tcMar>
-            <w:shd w:val="clear" w:color="auto" w:fill="E8EEF7"/>
-          </w:tcPr>
-          <w:p>
-            <w:pPr>
-              <w:spacing w:after="0"/>
-              <w:jc w:val="right"/>
-            </w:pPr>
-            <w:r>
-              <w:rPr>
-                <w:b/>
-                <w:sz w:val="19"/>
-              </w:rPr>
-              <w:t>6.643</w:t>
-            </w:r>
-          </w:p>
-        </w:tc>
-      </w:tr>
-      <w:tr>
-        <w:tc>
-          <w:tcPr>
-            <w:tcW w:type="dxa" w:w="5386"/>
-            <w:tcBorders>
-              <w:top w:val="single" w:sz="4" w:color="BFC9DC"/>
-              <w:left w:val="single" w:sz="4" w:color="BFC9DC"/>
-              <w:bottom w:val="single" w:sz="4" w:color="BFC9DC"/>
-              <w:right w:val="single" w:sz="4" w:color="BFC9DC"/>
-            </w:tcBorders>
-            <w:tcMar>
-              <w:left w:w="68" w:type="dxa"/>
-              <w:right w:w="68" w:type="dxa"/>
-            </w:tcMar>
-          </w:tcPr>
-          <w:p>
-            <w:pPr>
-              <w:spacing w:after="0"/>
-            </w:pPr>
-            <w:r>
-              <w:rPr>
-                <w:b w:val="0"/>
-                <w:sz w:val="19"/>
-              </w:rPr>
-              <w:t>+ Sinergias de backhaul</w:t>
+              <w:t>+ Ahorro por usar la red de fibra de ACC (más seguro)</w:t>
             </w:r>
           </w:p>
         </w:tc>
@@ -560,7 +418,7 @@
       <w:tr>
         <w:tc>
           <w:tcPr>
-            <w:tcW w:type="dxa" w:w="5386"/>
+            <w:tcW w:type="dxa" w:w="5953"/>
             <w:tcBorders>
               <w:top w:val="single" w:sz="4" w:color="BFC9DC"/>
               <w:left w:val="single" w:sz="4" w:color="BFC9DC"/>
@@ -581,7 +439,7 @@
                 <w:b w:val="0"/>
                 <w:sz w:val="19"/>
               </w:rPr>
-              <w:t>+ Sinergias de clientes empresariales</w:t>
+              <w:t>+ Ventas a empresas clientes de ACC (incierto)</w:t>
             </w:r>
           </w:p>
         </w:tc>
@@ -617,7 +475,7 @@
       <w:tr>
         <w:tc>
           <w:tcPr>
-            <w:tcW w:type="dxa" w:w="5386"/>
+            <w:tcW w:type="dxa" w:w="5953"/>
             <w:tcBorders>
               <w:top w:val="single" w:sz="4" w:color="BFC9DC"/>
               <w:left w:val="single" w:sz="4" w:color="BFC9DC"/>
@@ -639,7 +497,7 @@
                 <w:b/>
                 <w:sz w:val="19"/>
               </w:rPr>
-              <w:t>Valor del patrimonio con todas las sinergias</w:t>
+              <w:t>ATC con todos los beneficios de la unión</w:t>
             </w:r>
           </w:p>
         </w:tc>
@@ -673,6 +531,65 @@
           </w:p>
         </w:tc>
       </w:tr>
+      <w:tr>
+        <w:tc>
+          <w:tcPr>
+            <w:tcW w:type="dxa" w:w="5953"/>
+            <w:tcBorders>
+              <w:top w:val="single" w:sz="4" w:color="BFC9DC"/>
+              <w:left w:val="single" w:sz="4" w:color="BFC9DC"/>
+              <w:bottom w:val="single" w:sz="4" w:color="BFC9DC"/>
+              <w:right w:val="single" w:sz="4" w:color="BFC9DC"/>
+            </w:tcBorders>
+            <w:tcMar>
+              <w:left w:w="68" w:type="dxa"/>
+              <w:right w:w="68" w:type="dxa"/>
+            </w:tcMar>
+          </w:tcPr>
+          <w:p>
+            <w:pPr>
+              <w:spacing w:after="0"/>
+            </w:pPr>
+            <w:r>
+              <w:rPr>
+                <w:b w:val="0"/>
+                <w:i/>
+                <w:sz w:val="19"/>
+              </w:rPr>
+              <w:t>Referencia: precio según empresas parecidas</w:t>
+            </w:r>
+          </w:p>
+        </w:tc>
+        <w:tc>
+          <w:tcPr>
+            <w:tcW w:type="dxa" w:w="1587"/>
+            <w:tcBorders>
+              <w:top w:val="single" w:sz="4" w:color="BFC9DC"/>
+              <w:left w:val="single" w:sz="4" w:color="BFC9DC"/>
+              <w:bottom w:val="single" w:sz="4" w:color="BFC9DC"/>
+              <w:right w:val="single" w:sz="4" w:color="BFC9DC"/>
+            </w:tcBorders>
+            <w:tcMar>
+              <w:left w:w="68" w:type="dxa"/>
+              <w:right w:w="68" w:type="dxa"/>
+            </w:tcMar>
+          </w:tcPr>
+          <w:p>
+            <w:pPr>
+              <w:spacing w:after="0"/>
+              <w:jc w:val="right"/>
+            </w:pPr>
+            <w:r>
+              <w:rPr>
+                <w:b w:val="0"/>
+                <w:i/>
+                <w:sz w:val="19"/>
+              </w:rPr>
+              <w:t>13.950</w:t>
+            </w:r>
+          </w:p>
+        </w:tc>
+      </w:tr>
     </w:tbl>
     <w:p>
       <w:pPr>
@@ -696,7 +613,7 @@
           <w:color w:val="1F3864"/>
           <w:sz w:val="25"/>
         </w:rPr>
-        <w:t>2. Alternativas</w:t>
+        <w:t>3. Alternativas</w:t>
       </w:r>
     </w:p>
     <w:tbl>
@@ -715,7 +632,7 @@
       <w:tr>
         <w:tc>
           <w:tcPr>
-            <w:tcW w:type="dxa" w:w="1474"/>
+            <w:tcW w:type="dxa" w:w="1361"/>
             <w:shd w:val="clear" w:color="auto" w:fill="1F3864"/>
             <w:tcMar>
               <w:left w:w="68" w:type="dxa"/>
@@ -737,7 +654,7 @@
         </w:tc>
         <w:tc>
           <w:tcPr>
-            <w:tcW w:type="dxa" w:w="1928"/>
+            <w:tcW w:type="dxa" w:w="1984"/>
             <w:shd w:val="clear" w:color="auto" w:fill="1F3864"/>
             <w:tcMar>
               <w:left w:w="68" w:type="dxa"/>
@@ -754,7 +671,7 @@
                 <w:color w:val="FFFFFF"/>
                 <w:sz w:val="18"/>
               </w:rPr>
-              <w:t>A. Pagar solo el valor de ATC</w:t>
+              <w:t>A. Pagar solo lo que ATC vale por sí sola</w:t>
             </w:r>
           </w:p>
         </w:tc>
@@ -777,13 +694,13 @@
                 <w:color w:val="FFFFFF"/>
                 <w:sz w:val="18"/>
               </w:rPr>
-              <w:t>B. Compartir solo el backhaul (recomendada)</w:t>
+              <w:t>B. Compartir solo el ahorro de la fibra (recomendada)</w:t>
             </w:r>
           </w:p>
         </w:tc>
         <w:tc>
           <w:tcPr>
-            <w:tcW w:type="dxa" w:w="1928"/>
+            <w:tcW w:type="dxa" w:w="1984"/>
             <w:shd w:val="clear" w:color="auto" w:fill="1F3864"/>
             <w:tcMar>
               <w:left w:w="68" w:type="dxa"/>
@@ -800,13 +717,13 @@
                 <w:color w:val="FFFFFF"/>
                 <w:sz w:val="18"/>
               </w:rPr>
-              <w:t>C. Pagar todas las sinergias</w:t>
+              <w:t>C. Pagar todos los beneficios de la unión</w:t>
             </w:r>
           </w:p>
         </w:tc>
         <w:tc>
           <w:tcPr>
-            <w:tcW w:type="dxa" w:w="1928"/>
+            <w:tcW w:type="dxa" w:w="1984"/>
             <w:shd w:val="clear" w:color="auto" w:fill="1F3864"/>
             <w:tcMar>
               <w:left w:w="68" w:type="dxa"/>
@@ -823,7 +740,7 @@
                 <w:color w:val="FFFFFF"/>
                 <w:sz w:val="18"/>
               </w:rPr>
-              <w:t>D. No comprar: acuerdo de backhaul</w:t>
+              <w:t>D. No comprar y firmar un acuerdo comercial</w:t>
             </w:r>
           </w:p>
         </w:tc>
@@ -831,7 +748,7 @@
       <w:tr>
         <w:tc>
           <w:tcPr>
-            <w:tcW w:type="dxa" w:w="1474"/>
+            <w:tcW w:type="dxa" w:w="1361"/>
             <w:tcBorders>
               <w:top w:val="single" w:sz="4" w:color="BFC9DC"/>
               <w:left w:val="single" w:sz="4" w:color="BFC9DC"/>
@@ -859,7 +776,7 @@
         </w:tc>
         <w:tc>
           <w:tcPr>
-            <w:tcW w:type="dxa" w:w="1928"/>
+            <w:tcW w:type="dxa" w:w="1984"/>
             <w:tcBorders>
               <w:top w:val="single" w:sz="4" w:color="BFC9DC"/>
               <w:left w:val="single" w:sz="4" w:color="BFC9DC"/>
@@ -908,13 +825,13 @@
                 <w:b w:val="0"/>
                 <w:sz w:val="18"/>
               </w:rPr>
-              <w:t>5.979 a 7.391</w:t>
+              <w:t>Entre 5.979 y 7.391</w:t>
             </w:r>
           </w:p>
         </w:tc>
         <w:tc>
           <w:tcPr>
-            <w:tcW w:type="dxa" w:w="1928"/>
+            <w:tcW w:type="dxa" w:w="1984"/>
             <w:tcBorders>
               <w:top w:val="single" w:sz="4" w:color="BFC9DC"/>
               <w:left w:val="single" w:sz="4" w:color="BFC9DC"/>
@@ -941,7 +858,7 @@
         </w:tc>
         <w:tc>
           <w:tcPr>
-            <w:tcW w:type="dxa" w:w="1928"/>
+            <w:tcW w:type="dxa" w:w="1984"/>
             <w:tcBorders>
               <w:top w:val="single" w:sz="4" w:color="BFC9DC"/>
               <w:left w:val="single" w:sz="4" w:color="BFC9DC"/>
@@ -962,7 +879,7 @@
                 <w:b w:val="0"/>
                 <w:sz w:val="18"/>
               </w:rPr>
-              <w:t>Sin compra</w:t>
+              <w:t>No hay compra</w:t>
             </w:r>
           </w:p>
         </w:tc>
@@ -970,7 +887,7 @@
       <w:tr>
         <w:tc>
           <w:tcPr>
-            <w:tcW w:type="dxa" w:w="1474"/>
+            <w:tcW w:type="dxa" w:w="1361"/>
             <w:tcBorders>
               <w:top w:val="single" w:sz="4" w:color="BFC9DC"/>
               <w:left w:val="single" w:sz="4" w:color="BFC9DC"/>
@@ -992,13 +909,13 @@
                 <w:b/>
                 <w:sz w:val="18"/>
               </w:rPr>
-              <w:t>Valor que conserva ACC</w:t>
+              <w:t>Qué gana ACC</w:t>
             </w:r>
           </w:p>
         </w:tc>
         <w:tc>
           <w:tcPr>
-            <w:tcW w:type="dxa" w:w="1928"/>
+            <w:tcW w:type="dxa" w:w="1984"/>
             <w:tcBorders>
               <w:top w:val="single" w:sz="4" w:color="BFC9DC"/>
               <w:left w:val="single" w:sz="4" w:color="BFC9DC"/>
@@ -1019,7 +936,7 @@
                 <w:b w:val="0"/>
                 <w:sz w:val="18"/>
               </w:rPr>
-              <w:t>Todas las sinergias (2.524)</w:t>
+              <w:t>Se queda con todos los beneficios de la unión (2.524)</w:t>
             </w:r>
           </w:p>
         </w:tc>
@@ -1047,13 +964,13 @@
                 <w:b w:val="0"/>
                 <w:sz w:val="18"/>
               </w:rPr>
-              <w:t>Al menos las de ingresos (1.776)</w:t>
+              <w:t>Se queda con las ventas a empresas (1.776) como colchón</w:t>
             </w:r>
           </w:p>
         </w:tc>
         <w:tc>
           <w:tcPr>
-            <w:tcW w:type="dxa" w:w="1928"/>
+            <w:tcW w:type="dxa" w:w="1984"/>
             <w:tcBorders>
               <w:top w:val="single" w:sz="4" w:color="BFC9DC"/>
               <w:left w:val="single" w:sz="4" w:color="BFC9DC"/>
@@ -1074,13 +991,13 @@
                 <w:b w:val="0"/>
                 <w:sz w:val="18"/>
               </w:rPr>
-              <w:t>Ninguno</w:t>
+              <w:t>Nada: todo el beneficio se lo lleva el vendedor</w:t>
             </w:r>
           </w:p>
         </w:tc>
         <w:tc>
           <w:tcPr>
-            <w:tcW w:type="dxa" w:w="1928"/>
+            <w:tcW w:type="dxa" w:w="1984"/>
             <w:tcBorders>
               <w:top w:val="single" w:sz="4" w:color="BFC9DC"/>
               <w:left w:val="single" w:sz="4" w:color="BFC9DC"/>
@@ -1101,7 +1018,7 @@
                 <w:b w:val="0"/>
                 <w:sz w:val="18"/>
               </w:rPr>
-              <w:t>Parte del ahorro de backhaul (76 al año en 2012)</w:t>
+              <w:t>Cobra a ATC por usar su fibra (hasta 76 al año)</w:t>
             </w:r>
           </w:p>
         </w:tc>
@@ -1109,7 +1026,7 @@
       <w:tr>
         <w:tc>
           <w:tcPr>
-            <w:tcW w:type="dxa" w:w="1474"/>
+            <w:tcW w:type="dxa" w:w="1361"/>
             <w:tcBorders>
               <w:top w:val="single" w:sz="4" w:color="BFC9DC"/>
               <w:left w:val="single" w:sz="4" w:color="BFC9DC"/>
@@ -1131,13 +1048,13 @@
                 <w:b/>
                 <w:sz w:val="18"/>
               </w:rPr>
-              <w:t>Implicaciones</w:t>
+              <w:t>Qué implica</w:t>
             </w:r>
           </w:p>
         </w:tc>
         <w:tc>
           <w:tcPr>
-            <w:tcW w:type="dxa" w:w="1928"/>
+            <w:tcW w:type="dxa" w:w="1984"/>
             <w:tcBorders>
               <w:top w:val="single" w:sz="4" w:color="BFC9DC"/>
               <w:left w:val="single" w:sz="4" w:color="BFC9DC"/>
@@ -1158,7 +1075,7 @@
                 <w:b w:val="0"/>
                 <w:sz w:val="18"/>
               </w:rPr>
-              <w:t>El vendedor, anclado en múltiplos de mercado, probablemente no la acepte.</w:t>
+              <w:t>Es el precio más seguro, pero el vendedor difícilmente lo aceptará.</w:t>
             </w:r>
           </w:p>
         </w:tc>
@@ -1186,13 +1103,13 @@
                 <w:b w:val="0"/>
                 <w:sz w:val="18"/>
               </w:rPr>
-              <w:t>Prima de 11,3% sobre el valor de ATC (6,5 veces el EBITDA). El vendedor cobra algo que no podría lograr por su cuenta.</w:t>
+              <w:t>El vendedor recibe 11,3% más de lo que ATC vale por sí sola.</w:t>
             </w:r>
           </w:p>
         </w:tc>
         <w:tc>
           <w:tcPr>
-            <w:tcW w:type="dxa" w:w="1928"/>
+            <w:tcW w:type="dxa" w:w="1984"/>
             <w:tcBorders>
               <w:top w:val="single" w:sz="4" w:color="BFC9DC"/>
               <w:left w:val="single" w:sz="4" w:color="BFC9DC"/>
@@ -1213,13 +1130,13 @@
                 <w:b w:val="0"/>
                 <w:sz w:val="18"/>
               </w:rPr>
-              <w:t>Gana cualquier subasta, pero si solo se logra la mitad de las sinergias de ingresos, ACC pierde 888.</w:t>
+              <w:t>Gana cualquier subasta, pero si las ventas a empresas salen a medias, ACC pierde 888.</w:t>
             </w:r>
           </w:p>
         </w:tc>
         <w:tc>
           <w:tcPr>
-            <w:tcW w:type="dxa" w:w="1928"/>
+            <w:tcW w:type="dxa" w:w="1984"/>
             <w:tcBorders>
               <w:top w:val="single" w:sz="4" w:color="BFC9DC"/>
               <w:left w:val="single" w:sz="4" w:color="BFC9DC"/>
@@ -1240,7 +1157,7 @@
                 <w:b w:val="0"/>
                 <w:sz w:val="18"/>
               </w:rPr>
-              <w:t>No requiere deuda, pero ACC sigue sin oferta inalámbrica.</w:t>
+              <w:t>No requiere deuda, pero ACC sigue sin telefonía celular.</w:t>
             </w:r>
           </w:p>
         </w:tc>
@@ -1248,7 +1165,7 @@
       <w:tr>
         <w:tc>
           <w:tcPr>
-            <w:tcW w:type="dxa" w:w="1474"/>
+            <w:tcW w:type="dxa" w:w="1361"/>
             <w:tcBorders>
               <w:top w:val="single" w:sz="4" w:color="BFC9DC"/>
               <w:left w:val="single" w:sz="4" w:color="BFC9DC"/>
@@ -1270,13 +1187,13 @@
                 <w:b/>
                 <w:sz w:val="18"/>
               </w:rPr>
-              <w:t>Riesgo principal</w:t>
+              <w:t>Mayor riesgo</w:t>
             </w:r>
           </w:p>
         </w:tc>
         <w:tc>
           <w:tcPr>
-            <w:tcW w:type="dxa" w:w="1928"/>
+            <w:tcW w:type="dxa" w:w="1984"/>
             <w:tcBorders>
               <w:top w:val="single" w:sz="4" w:color="BFC9DC"/>
               <w:left w:val="single" w:sz="4" w:color="BFC9DC"/>
@@ -1297,7 +1214,7 @@
                 <w:b w:val="0"/>
                 <w:sz w:val="18"/>
               </w:rPr>
-              <w:t>Perder ATC frente a otro comprador.</w:t>
+              <w:t>Que otro comprador se quede con ATC.</w:t>
             </w:r>
           </w:p>
         </w:tc>
@@ -1325,13 +1242,13 @@
                 <w:b w:val="0"/>
                 <w:sz w:val="18"/>
               </w:rPr>
-              <w:t>Que el vendedor no baje de los precios del mercado.</w:t>
+              <w:t>Que el vendedor no acepte bajar su precio.</w:t>
             </w:r>
           </w:p>
         </w:tc>
         <w:tc>
           <w:tcPr>
-            <w:tcW w:type="dxa" w:w="1928"/>
+            <w:tcW w:type="dxa" w:w="1984"/>
             <w:tcBorders>
               <w:top w:val="single" w:sz="4" w:color="BFC9DC"/>
               <w:left w:val="single" w:sz="4" w:color="BFC9DC"/>
@@ -1352,13 +1269,13 @@
                 <w:b w:val="0"/>
                 <w:sz w:val="18"/>
               </w:rPr>
-              <w:t>Pagar de más: transfiere al vendedor todo el valor que crea ACC.</w:t>
+              <w:t>Pagar de más.</w:t>
             </w:r>
           </w:p>
         </w:tc>
         <w:tc>
           <w:tcPr>
-            <w:tcW w:type="dxa" w:w="1928"/>
+            <w:tcW w:type="dxa" w:w="1984"/>
             <w:tcBorders>
               <w:top w:val="single" w:sz="4" w:color="BFC9DC"/>
               <w:left w:val="single" w:sz="4" w:color="BFC9DC"/>
@@ -1399,7 +1316,7 @@
           <w:color w:val="1F3864"/>
           <w:sz w:val="25"/>
         </w:rPr>
-        <w:t>3. Recomendación: alternativa B, con tope de US$7.391 millones</w:t>
+        <w:t>4. Recomendación: alternativa B</w:t>
       </w:r>
     </w:p>
     <w:p>
@@ -1413,14 +1330,14 @@
           <w:b/>
           <w:sz w:val="21"/>
         </w:rPr>
-        <w:t xml:space="preserve">El precio es disciplinado. </w:t>
+        <w:t xml:space="preserve">Es un precio razonable. </w:t>
       </w:r>
       <w:r>
         <w:rPr>
           <w:b w:val="0"/>
           <w:sz w:val="21"/>
         </w:rPr>
-        <w:t>US$7.391 millones equivalen a 6,5 veces el EBITDA de 2007 y a una prima de 11,3% sobre el valor de ATC. El P/U histórico de la industria da un valor similar (US$6.010 millones); los múltiplos actuales de los comparables suponen un crecimiento que ATC no puede sostener con sus márgenes.</w:t>
+        <w:t>Pagar hasta US$7.391 millones significa reconocerle al vendedor 11,3% sobre lo que ATC vale por sí sola. Otro método, basado en las utilidades históricas del sector, da un valor parecido (US$6.010 millones).</w:t>
       </w:r>
     </w:p>
     <w:p>
@@ -1434,14 +1351,14 @@
           <w:b/>
           <w:sz w:val="21"/>
         </w:rPr>
-        <w:t xml:space="preserve">Solo se paga lo que ACC controla. </w:t>
+        <w:t xml:space="preserve">Solo pagamos lo que depende de nosotros. </w:t>
       </w:r>
       <w:r>
         <w:rPr>
           <w:b w:val="0"/>
           <w:sz w:val="21"/>
         </w:rPr>
-        <w:t>El ahorro de backhaul depende de la fibra de ACC y es la sinergia más cierta. Las sinergias de clientes empresariales (US$1.776 millones) quedan como margen de seguridad para ACC.</w:t>
+        <w:t>El ahorro de la fibra lo genera la red de ACC y es el beneficio más seguro. Las ventas a empresas (US$1.776 millones) no se pagan por adelantado: quedan como colchón si algo sale mal.</w:t>
       </w:r>
     </w:p>
     <w:p>
@@ -1455,14 +1372,14 @@
           <w:b/>
           <w:sz w:val="21"/>
         </w:rPr>
-        <w:t xml:space="preserve">Estrategia de negociación. </w:t>
+        <w:t xml:space="preserve">Cómo negociar. </w:t>
       </w:r>
       <w:r>
         <w:rPr>
           <w:b w:val="0"/>
           <w:sz w:val="21"/>
         </w:rPr>
-        <w:t>Abrir en US$5.979 millones: el valor de ATC menos el 10% que le costaría salir a bolsa, que es la alternativa real del vendedor. Buscar US$7.017 millones, que comparte la mitad del ahorro de backhaul. Si el vendedor pide más, ofrecer un pago adicional condicionado a que se cumplan las metas de clientes empresariales, en vez de subir el precio fijo.</w:t>
+        <w:t>Abrir en US$5.979 millones: lo que ATC vale por sí sola menos el 10% que le costaría vender acciones en bolsa, que es la otra opción del vendedor. Buscar cerrar en US$7.017 millones. Si el vendedor pide más, ofrecer un pago adicional solo si se cumplen las metas de ventas a empresas, en lugar de subir el precio fijo.</w:t>
       </w:r>
     </w:p>
     <w:p>
@@ -1476,14 +1393,35 @@
           <w:b/>
           <w:sz w:val="21"/>
         </w:rPr>
-        <w:t xml:space="preserve">Condiciones para firmar. </w:t>
+        <w:t xml:space="preserve">La financiación es viable si ACC la respalda. </w:t>
       </w:r>
       <w:r>
         <w:rPr>
           <w:b w:val="0"/>
           <w:sz w:val="21"/>
         </w:rPr>
-        <w:t>(a) Revisar las afiliadas, que aportan US$1.719 millones (26% del valor). (b) Que la deuda no supere el 50% del valor: reducir el préstamo propuesto o aportar más capital, y garantizar la línea de crédito que ATC necesitará. (c) Si el precio supera US$7.391 millones, retirarse y negociar con ATC un acuerdo comercial de backhaul (alternativa D).</w:t>
+        <w:t>El préstamo de US$3.758 millones está dentro del límite del banco, y la deuda baja de 3,2 a 1,6 veces la utilidad operativa entre 2008 y 2012, lo que facilita renovar el saldo de 2012. Pero ACC debe comprometerse a cubrir el crédito adicional de hasta US$563 millones. Si el banco calcula el límite solo sobre el negocio celular, conviene pedir un préstamo menor (US$2.994 millones) y que ACC aporte la diferencia (US$763 millones) con recursos propios.</w:t>
+      </w:r>
+    </w:p>
+    <w:p>
+      <w:pPr>
+        <w:pStyle w:val="ListNumber"/>
+        <w:spacing w:after="80"/>
+        <w:ind w:left="340"/>
+      </w:pPr>
+      <w:r>
+        <w:rPr>
+          <w:b/>
+          <w:sz w:val="21"/>
+        </w:rPr>
+        <w:t xml:space="preserve">Antes de firmar. </w:t>
+      </w:r>
+      <w:r>
+        <w:rPr>
+          <w:b w:val="0"/>
+          <w:sz w:val="21"/>
+        </w:rPr>
+        <w:t>Revisar a fondo las inversiones de ATC en otras empresas, que representan US$1.719 millones (26% del valor). Si el precio supera US$7.391 millones, retirarse y proponer a ATC un acuerdo para alquilarle la fibra de ACC (alternativa D).</w:t>
       </w:r>
     </w:p>
     <w:p>

</xml_diff>